<commit_message>
demo: live pipeline test
</commit_message>
<xml_diff>
--- a/CI-CD-Demo-Presentation.docx
+++ b/CI-CD-Demo-Presentation.docx
@@ -1128,7 +1128,7 @@
           </w:tcPr>
           <w:p>
             <w:r>
-              <w:t>During CI pipeline</w:t>
+              <w:t>During CI (after push, before sign)</w:t>
             </w:r>
           </w:p>
         </w:tc>
@@ -1641,15 +1641,777 @@
         <w:pStyle w:val="Heading1"/>
       </w:pPr>
       <w:r>
-        <w:t>One-Time Setup Per Cluster</w:t>
+        <w:t>Why Is Trivy Scan After Docker Push?</w:t>
       </w:r>
     </w:p>
     <w:p>
       <w:r>
-        <w:t>All the setup (ArgoCD, Image Updater, Kyverno, Cosign, repo credentials) is one-time per cluster. Same steps apply to EKS/AKS/GKE. After that, every new deployment is just a git push.</w:t>
+        <w:t>This is a deliberate design choice. docker buildx builds multi-architecture images (AMD64 + ARM64) and pushes directly to the registry — there is no local image to scan. Trivy needs the final multi-arch manifest on the registry to scan accurately.</w:t>
+      </w:r>
+    </w:p>
+    <w:p>
+      <w:r>
+        <w:t>The safety net: If Trivy finds CRITICAL/HIGH CVEs → pipeline fails → image is NEVER signed → Kyverno BLOCKS it from deploying. So even though the image is on Docker Hub, it can never reach your pods.</w:t>
+      </w:r>
+    </w:p>
+    <w:tbl>
+      <w:tblPr>
+        <w:tblStyle w:val="LightShading-Accent1"/>
+        <w:tblW w:type="auto" w:w="0"/>
+        <w:jc w:val="center"/>
+        <w:tblLook w:firstColumn="1" w:firstRow="1" w:lastColumn="0" w:lastRow="0" w:noHBand="0" w:noVBand="1" w:val="04A0"/>
+      </w:tblPr>
+      <w:tblGrid>
+        <w:gridCol w:w="2880"/>
+        <w:gridCol w:w="2880"/>
+        <w:gridCol w:w="2880"/>
+      </w:tblGrid>
+      <w:tr>
+        <w:tc>
+          <w:tcPr>
+            <w:tcW w:type="dxa" w:w="2880"/>
+          </w:tcPr>
+          <w:p>
+            <w:r>
+              <w:rPr>
+                <w:b/>
+              </w:rPr>
+              <w:t>Step</w:t>
+            </w:r>
+          </w:p>
+        </w:tc>
+        <w:tc>
+          <w:tcPr>
+            <w:tcW w:type="dxa" w:w="2880"/>
+          </w:tcPr>
+          <w:p>
+            <w:r>
+              <w:rPr>
+                <w:b/>
+              </w:rPr>
+              <w:t>Action</w:t>
+            </w:r>
+          </w:p>
+        </w:tc>
+        <w:tc>
+          <w:tcPr>
+            <w:tcW w:type="dxa" w:w="2880"/>
+          </w:tcPr>
+          <w:p>
+            <w:r>
+              <w:rPr>
+                <w:b/>
+              </w:rPr>
+              <w:t>What Happens on Failure</w:t>
+            </w:r>
+          </w:p>
+        </w:tc>
+      </w:tr>
+      <w:tr>
+        <w:tc>
+          <w:tcPr>
+            <w:tcW w:type="dxa" w:w="2880"/>
+          </w:tcPr>
+          <w:p>
+            <w:r>
+              <w:t>1. Build &amp; Push</w:t>
+            </w:r>
+          </w:p>
+        </w:tc>
+        <w:tc>
+          <w:tcPr>
+            <w:tcW w:type="dxa" w:w="2880"/>
+          </w:tcPr>
+          <w:p>
+            <w:r>
+              <w:t>docker buildx builds multi-arch image, pushes to Docker Hub</w:t>
+            </w:r>
+          </w:p>
+        </w:tc>
+        <w:tc>
+          <w:tcPr>
+            <w:tcW w:type="dxa" w:w="2880"/>
+          </w:tcPr>
+          <w:p>
+            <w:r>
+              <w:t>Pipeline fails — no image published</w:t>
+            </w:r>
+          </w:p>
+        </w:tc>
+      </w:tr>
+      <w:tr>
+        <w:tc>
+          <w:tcPr>
+            <w:tcW w:type="dxa" w:w="2880"/>
+          </w:tcPr>
+          <w:p>
+            <w:r>
+              <w:t>2. Trivy Scan</w:t>
+            </w:r>
+          </w:p>
+        </w:tc>
+        <w:tc>
+          <w:tcPr>
+            <w:tcW w:type="dxa" w:w="2880"/>
+          </w:tcPr>
+          <w:p>
+            <w:r>
+              <w:t>Scans pushed image for CRITICAL/HIGH CVEs</w:t>
+            </w:r>
+          </w:p>
+        </w:tc>
+        <w:tc>
+          <w:tcPr>
+            <w:tcW w:type="dxa" w:w="2880"/>
+          </w:tcPr>
+          <w:p>
+            <w:r>
+              <w:t>Pipeline fails — image stays UNSIGNED</w:t>
+            </w:r>
+          </w:p>
+        </w:tc>
+      </w:tr>
+      <w:tr>
+        <w:tc>
+          <w:tcPr>
+            <w:tcW w:type="dxa" w:w="2880"/>
+          </w:tcPr>
+          <w:p>
+            <w:r>
+              <w:t>3. Cosign Sign</w:t>
+            </w:r>
+          </w:p>
+        </w:tc>
+        <w:tc>
+          <w:tcPr>
+            <w:tcW w:type="dxa" w:w="2880"/>
+          </w:tcPr>
+          <w:p>
+            <w:r>
+              <w:t>Signs image with private key</w:t>
+            </w:r>
+          </w:p>
+        </w:tc>
+        <w:tc>
+          <w:tcPr>
+            <w:tcW w:type="dxa" w:w="2880"/>
+          </w:tcPr>
+          <w:p>
+            <w:r>
+              <w:t>Without signature, Kyverno blocks deployment</w:t>
+            </w:r>
+          </w:p>
+        </w:tc>
+      </w:tr>
+    </w:tbl>
+    <w:p>
+      <w:r>
+        <w:br w:type="page"/>
+      </w:r>
+    </w:p>
+    <w:p>
+      <w:pPr>
+        <w:pStyle w:val="Heading1"/>
+      </w:pPr>
+      <w:r>
+        <w:t>One-Time Cluster Setup (Complete Commands)</w:t>
+      </w:r>
+    </w:p>
+    <w:p>
+      <w:r>
+        <w:t>All the setup below is one-time per cluster. Same steps apply to EKS/AKS/GKE. After this, every new deployment is just a git push.</w:t>
+      </w:r>
+    </w:p>
+    <w:p>
+      <w:pPr>
+        <w:pStyle w:val="Heading2"/>
+      </w:pPr>
+      <w:r>
+        <w:t>Step 1: Create the Cluster</w:t>
+      </w:r>
+    </w:p>
+    <w:p>
+      <w:r>
+        <w:rPr>
+          <w:rFonts w:ascii="Consolas" w:hAnsi="Consolas"/>
+          <w:sz w:val="18"/>
+        </w:rPr>
+        <w:t>export KIND_EXPERIMENTAL_PROVIDER=podman</w:t>
+        <w:br/>
+        <w:t>kind create cluster --name java-demo-cluster --config kind-cluster-config.yaml</w:t>
+        <w:br/>
+        <w:t>kubectl get nodes</w:t>
+        <w:br/>
+        <w:t># Expected: 3 nodes (1 control-plane + 2 workers)</w:t>
+      </w:r>
+    </w:p>
+    <w:p>
+      <w:pPr>
+        <w:pStyle w:val="Heading2"/>
+      </w:pPr>
+      <w:r>
+        <w:t>Step 2: Install ArgoCD</w:t>
+      </w:r>
+    </w:p>
+    <w:p>
+      <w:r>
+        <w:rPr>
+          <w:rFonts w:ascii="Consolas" w:hAnsi="Consolas"/>
+          <w:sz w:val="18"/>
+        </w:rPr>
+        <w:t>kubectl create namespace argocd</w:t>
+        <w:br/>
+        <w:t>kubectl apply -n argocd -f https://raw.githubusercontent.com/argoproj/argo-cd/stable/manifests/install.yaml</w:t>
+        <w:br/>
+        <w:t>kubectl wait --for=condition=available --timeout=300s deployment/argocd-server -n argocd</w:t>
+        <w:br/>
+        <w:t># Get admin password:</w:t>
+        <w:br/>
+        <w:t>kubectl get secret argocd-initial-admin-secret -n argocd -o jsonpath="{.data.password}" | base64 -d</w:t>
+      </w:r>
+    </w:p>
+    <w:p>
+      <w:pPr>
+        <w:pStyle w:val="Heading2"/>
+      </w:pPr>
+      <w:r>
+        <w:t>Step 3: Install ArgoCD Image Updater</w:t>
+      </w:r>
+    </w:p>
+    <w:p>
+      <w:r>
+        <w:rPr>
+          <w:rFonts w:ascii="Consolas" w:hAnsi="Consolas"/>
+          <w:sz w:val="18"/>
+        </w:rPr>
+        <w:t>kubectl apply -n argocd \</w:t>
+        <w:br/>
+        <w:t xml:space="preserve">  -f https://raw.githubusercontent.com/argoproj-labs/argocd-image-updater/v0.14.0/manifests/install.yaml</w:t>
+        <w:br/>
+        <w:t>kubectl get pods -n argocd -l app.kubernetes.io/name=argocd-image-updater</w:t>
+      </w:r>
+    </w:p>
+    <w:p>
+      <w:pPr>
+        <w:pStyle w:val="Heading2"/>
+      </w:pPr>
+      <w:r>
+        <w:t>Step 4: Install Kyverno</w:t>
+      </w:r>
+    </w:p>
+    <w:p>
+      <w:r>
+        <w:rPr>
+          <w:rFonts w:ascii="Consolas" w:hAnsi="Consolas"/>
+          <w:sz w:val="18"/>
+        </w:rPr>
+        <w:t>kubectl create -f https://github.com/kyverno/kyverno/releases/download/v1.12.0/install.yaml</w:t>
+        <w:br/>
+        <w:t>kubectl wait --for=condition=available --timeout=300s deployment/kyverno-admission-controller -n kyverno</w:t>
+      </w:r>
+    </w:p>
+    <w:p>
+      <w:pPr>
+        <w:pStyle w:val="Heading2"/>
+      </w:pPr>
+      <w:r>
+        <w:t>Step 5: Generate Cosign Key Pair</w:t>
+      </w:r>
+    </w:p>
+    <w:p>
+      <w:r>
+        <w:rPr>
+          <w:rFonts w:ascii="Consolas" w:hAnsi="Consolas"/>
+          <w:sz w:val="18"/>
+        </w:rPr>
+        <w:t>cosign generate-key-pair</w:t>
+        <w:br/>
+        <w:t># Creates: cosign.key (PRIVATE → GitHub Secrets) and cosign.pub (PUBLIC → Kyverno policy)</w:t>
+      </w:r>
+    </w:p>
+    <w:p>
+      <w:pPr>
+        <w:pStyle w:val="Heading2"/>
+      </w:pPr>
+      <w:r>
+        <w:t>Step 6: Create All Credential Secrets</w:t>
+      </w:r>
+    </w:p>
+    <w:p>
+      <w:r>
+        <w:t>ArgoCD namespace (for Image Updater):</w:t>
+      </w:r>
+    </w:p>
+    <w:p>
+      <w:r>
+        <w:rPr>
+          <w:rFonts w:ascii="Consolas" w:hAnsi="Consolas"/>
+          <w:sz w:val="18"/>
+        </w:rPr>
+        <w:t># Git repo credentials (for Image Updater git write-back)</w:t>
+        <w:br/>
+        <w:t>kubectl create secret generic repo-crd-poc -n argocd \</w:t>
+        <w:br/>
+        <w:t xml:space="preserve">  --from-literal=type=git \</w:t>
+        <w:br/>
+        <w:t xml:space="preserve">  --from-literal=url=https://github.com/&lt;org&gt;/&lt;repo&gt;.git \</w:t>
+        <w:br/>
+        <w:t xml:space="preserve">  --from-literal=username=&lt;github-user&gt; \</w:t>
+        <w:br/>
+        <w:t xml:space="preserve">  --from-literal=password=&lt;github-pat&gt;</w:t>
+        <w:br/>
+        <w:t>kubectl label secret repo-crd-poc -n argocd argocd.argoproj.io/secret-type=repository</w:t>
+        <w:br/>
+        <w:br/>
+        <w:t># Docker Hub credentials (for Image Updater to poll tags)</w:t>
+        <w:br/>
+        <w:t>kubectl create secret docker-registry dockerhub-creds -n argocd \</w:t>
+        <w:br/>
+        <w:t xml:space="preserve">  --docker-server=https://registry-1.docker.io \</w:t>
+        <w:br/>
+        <w:t xml:space="preserve">  --docker-username=&lt;docker-user&gt; \</w:t>
+        <w:br/>
+        <w:t xml:space="preserve">  --docker-password=&lt;docker-password&gt;</w:t>
+      </w:r>
+    </w:p>
+    <w:p>
+      <w:r>
+        <w:t>Kyverno namespace (for signature verification):</w:t>
+      </w:r>
+    </w:p>
+    <w:p>
+      <w:r>
+        <w:rPr>
+          <w:rFonts w:ascii="Consolas" w:hAnsi="Consolas"/>
+          <w:sz w:val="18"/>
+        </w:rPr>
+        <w:t># Two secrets needed (Docker Hub uses two registry URLs)</w:t>
+        <w:br/>
+        <w:t>kubectl create secret docker-registry docker-hub-creds -n kyverno \</w:t>
+        <w:br/>
+        <w:t xml:space="preserve">  --docker-server=https://index.docker.io/v1/ \</w:t>
+        <w:br/>
+        <w:t xml:space="preserve">  --docker-username=&lt;docker-user&gt; --docker-password=&lt;docker-password&gt;</w:t>
+        <w:br/>
+        <w:t>kubectl annotate secret docker-hub-creds -n kyverno kyverno.io/docker-config=true</w:t>
+        <w:br/>
+        <w:br/>
+        <w:t>kubectl create secret docker-registry docker-hub-creds-v2 -n kyverno \</w:t>
+        <w:br/>
+        <w:t xml:space="preserve">  --docker-server=https://registry-1.docker.io \</w:t>
+        <w:br/>
+        <w:t xml:space="preserve">  --docker-username=&lt;docker-user&gt; --docker-password=&lt;docker-password&gt;</w:t>
+        <w:br/>
+        <w:t>kubectl annotate secret docker-hub-creds-v2 -n kyverno kyverno.io/docker-config=true</w:t>
+      </w:r>
+    </w:p>
+    <w:p>
+      <w:r>
+        <w:t>GitHub Secrets (in GitHub UI → Settings → Secrets → Actions):</w:t>
+      </w:r>
+    </w:p>
+    <w:tbl>
+      <w:tblPr>
+        <w:tblStyle w:val="LightShading-Accent1"/>
+        <w:tblW w:type="auto" w:w="0"/>
+        <w:jc w:val="center"/>
+        <w:tblLook w:firstColumn="1" w:firstRow="1" w:lastColumn="0" w:lastRow="0" w:noHBand="0" w:noVBand="1" w:val="04A0"/>
+      </w:tblPr>
+      <w:tblGrid>
+        <w:gridCol w:w="4320"/>
+        <w:gridCol w:w="4320"/>
+      </w:tblGrid>
+      <w:tr>
+        <w:tc>
+          <w:tcPr>
+            <w:tcW w:type="dxa" w:w="4320"/>
+          </w:tcPr>
+          <w:p>
+            <w:r>
+              <w:rPr>
+                <w:b/>
+              </w:rPr>
+              <w:t>Secret</w:t>
+            </w:r>
+          </w:p>
+        </w:tc>
+        <w:tc>
+          <w:tcPr>
+            <w:tcW w:type="dxa" w:w="4320"/>
+          </w:tcPr>
+          <w:p>
+            <w:r>
+              <w:rPr>
+                <w:b/>
+              </w:rPr>
+              <w:t>Value</w:t>
+            </w:r>
+          </w:p>
+        </w:tc>
+      </w:tr>
+      <w:tr>
+        <w:tc>
+          <w:tcPr>
+            <w:tcW w:type="dxa" w:w="4320"/>
+          </w:tcPr>
+          <w:p>
+            <w:r>
+              <w:t>DOCKER_USERNAME</w:t>
+            </w:r>
+          </w:p>
+        </w:tc>
+        <w:tc>
+          <w:tcPr>
+            <w:tcW w:type="dxa" w:w="4320"/>
+          </w:tcPr>
+          <w:p>
+            <w:r>
+              <w:t>Docker Hub username</w:t>
+            </w:r>
+          </w:p>
+        </w:tc>
+      </w:tr>
+      <w:tr>
+        <w:tc>
+          <w:tcPr>
+            <w:tcW w:type="dxa" w:w="4320"/>
+          </w:tcPr>
+          <w:p>
+            <w:r>
+              <w:t>DOCKER_PASSWORD</w:t>
+            </w:r>
+          </w:p>
+        </w:tc>
+        <w:tc>
+          <w:tcPr>
+            <w:tcW w:type="dxa" w:w="4320"/>
+          </w:tcPr>
+          <w:p>
+            <w:r>
+              <w:t>Docker Hub access token</w:t>
+            </w:r>
+          </w:p>
+        </w:tc>
+      </w:tr>
+      <w:tr>
+        <w:tc>
+          <w:tcPr>
+            <w:tcW w:type="dxa" w:w="4320"/>
+          </w:tcPr>
+          <w:p>
+            <w:r>
+              <w:t>COSIGN_PRIVATE_KEY</w:t>
+            </w:r>
+          </w:p>
+        </w:tc>
+        <w:tc>
+          <w:tcPr>
+            <w:tcW w:type="dxa" w:w="4320"/>
+          </w:tcPr>
+          <w:p>
+            <w:r>
+              <w:t>Contents of cosign.key file</w:t>
+            </w:r>
+          </w:p>
+        </w:tc>
+      </w:tr>
+      <w:tr>
+        <w:tc>
+          <w:tcPr>
+            <w:tcW w:type="dxa" w:w="4320"/>
+          </w:tcPr>
+          <w:p>
+            <w:r>
+              <w:t>COSIGN_PASSWORD</w:t>
+            </w:r>
+          </w:p>
+        </w:tc>
+        <w:tc>
+          <w:tcPr>
+            <w:tcW w:type="dxa" w:w="4320"/>
+          </w:tcPr>
+          <w:p>
+            <w:r>
+              <w:t>Cosign key password</w:t>
+            </w:r>
+          </w:p>
+        </w:tc>
+      </w:tr>
+    </w:tbl>
+    <w:p>
+      <w:pPr>
+        <w:pStyle w:val="Heading2"/>
+      </w:pPr>
+      <w:r>
+        <w:t>Step 7: Deploy the Application</w:t>
+      </w:r>
+    </w:p>
+    <w:p>
+      <w:r>
+        <w:rPr>
+          <w:rFonts w:ascii="Consolas" w:hAnsi="Consolas"/>
+          <w:sz w:val="18"/>
+        </w:rPr>
+        <w:t>kubectl apply -f k8s/platform/kyverno-verify-images.yaml    # Signature verification policy</w:t>
+        <w:br/>
+        <w:t>kubectl apply -f k8s/platform/argocd-application-v2.yaml    # ArgoCD app with Image Updater annotations</w:t>
+      </w:r>
+    </w:p>
+    <w:p>
+      <w:pPr>
+        <w:pStyle w:val="Heading2"/>
+      </w:pPr>
+      <w:r>
+        <w:t>Step 8: Verify the Setup</w:t>
+      </w:r>
+    </w:p>
+    <w:p>
+      <w:r>
+        <w:rPr>
+          <w:rFonts w:ascii="Consolas" w:hAnsi="Consolas"/>
+          <w:sz w:val="18"/>
+        </w:rPr>
+        <w:t>kubectl get pods -n argocd        # ArgoCD + Image Updater</w:t>
+        <w:br/>
+        <w:t>kubectl get pods -n kyverno       # Kyverno</w:t>
+        <w:br/>
+        <w:t>kubectl get pods -n default       # App (3 replicas)</w:t>
+        <w:br/>
+        <w:t>kubectl port-forward svc/java-demo-app 8083:80 -n default &amp;</w:t>
+        <w:br/>
+        <w:t>curl http://localhost:8083/</w:t>
       </w:r>
     </w:p>
     <w:p/>
+    <w:tbl>
+      <w:tblPr>
+        <w:tblStyle w:val="LightShading-Accent1"/>
+        <w:tblW w:type="auto" w:w="0"/>
+        <w:jc w:val="center"/>
+        <w:tblLook w:firstColumn="1" w:firstRow="1" w:lastColumn="0" w:lastRow="0" w:noHBand="0" w:noVBand="1" w:val="04A0"/>
+      </w:tblPr>
+      <w:tblGrid>
+        <w:gridCol w:w="2880"/>
+        <w:gridCol w:w="2880"/>
+        <w:gridCol w:w="2880"/>
+      </w:tblGrid>
+      <w:tr>
+        <w:tc>
+          <w:tcPr>
+            <w:tcW w:type="dxa" w:w="2880"/>
+          </w:tcPr>
+          <w:p>
+            <w:r>
+              <w:rPr>
+                <w:b/>
+              </w:rPr>
+              <w:t>Component</w:t>
+            </w:r>
+          </w:p>
+        </w:tc>
+        <w:tc>
+          <w:tcPr>
+            <w:tcW w:type="dxa" w:w="2880"/>
+          </w:tcPr>
+          <w:p>
+            <w:r>
+              <w:rPr>
+                <w:b/>
+              </w:rPr>
+              <w:t>Namespace</w:t>
+            </w:r>
+          </w:p>
+        </w:tc>
+        <w:tc>
+          <w:tcPr>
+            <w:tcW w:type="dxa" w:w="2880"/>
+          </w:tcPr>
+          <w:p>
+            <w:r>
+              <w:rPr>
+                <w:b/>
+              </w:rPr>
+              <w:t>Purpose</w:t>
+            </w:r>
+          </w:p>
+        </w:tc>
+      </w:tr>
+      <w:tr>
+        <w:tc>
+          <w:tcPr>
+            <w:tcW w:type="dxa" w:w="2880"/>
+          </w:tcPr>
+          <w:p>
+            <w:r>
+              <w:t>ArgoCD v3.3.6</w:t>
+            </w:r>
+          </w:p>
+        </w:tc>
+        <w:tc>
+          <w:tcPr>
+            <w:tcW w:type="dxa" w:w="2880"/>
+          </w:tcPr>
+          <w:p>
+            <w:r>
+              <w:t>argocd</w:t>
+            </w:r>
+          </w:p>
+        </w:tc>
+        <w:tc>
+          <w:tcPr>
+            <w:tcW w:type="dxa" w:w="2880"/>
+          </w:tcPr>
+          <w:p>
+            <w:r>
+              <w:t>GitOps controller — syncs K8s manifests from Git</w:t>
+            </w:r>
+          </w:p>
+        </w:tc>
+      </w:tr>
+      <w:tr>
+        <w:tc>
+          <w:tcPr>
+            <w:tcW w:type="dxa" w:w="2880"/>
+          </w:tcPr>
+          <w:p>
+            <w:r>
+              <w:t>Image Updater v0.14.0</w:t>
+            </w:r>
+          </w:p>
+        </w:tc>
+        <w:tc>
+          <w:tcPr>
+            <w:tcW w:type="dxa" w:w="2880"/>
+          </w:tcPr>
+          <w:p>
+            <w:r>
+              <w:t>argocd</w:t>
+            </w:r>
+          </w:p>
+        </w:tc>
+        <w:tc>
+          <w:tcPr>
+            <w:tcW w:type="dxa" w:w="2880"/>
+          </w:tcPr>
+          <w:p>
+            <w:r>
+              <w:t>Watches Docker Hub → commits new tags to Git</w:t>
+            </w:r>
+          </w:p>
+        </w:tc>
+      </w:tr>
+      <w:tr>
+        <w:tc>
+          <w:tcPr>
+            <w:tcW w:type="dxa" w:w="2880"/>
+          </w:tcPr>
+          <w:p>
+            <w:r>
+              <w:t>Kyverno v1.12.0</w:t>
+            </w:r>
+          </w:p>
+        </w:tc>
+        <w:tc>
+          <w:tcPr>
+            <w:tcW w:type="dxa" w:w="2880"/>
+          </w:tcPr>
+          <w:p>
+            <w:r>
+              <w:t>kyverno</w:t>
+            </w:r>
+          </w:p>
+        </w:tc>
+        <w:tc>
+          <w:tcPr>
+            <w:tcW w:type="dxa" w:w="2880"/>
+          </w:tcPr>
+          <w:p>
+            <w:r>
+              <w:t>Admission controller — blocks unsigned images</w:t>
+            </w:r>
+          </w:p>
+        </w:tc>
+      </w:tr>
+      <w:tr>
+        <w:tc>
+          <w:tcPr>
+            <w:tcW w:type="dxa" w:w="2880"/>
+          </w:tcPr>
+          <w:p>
+            <w:r>
+              <w:t>Cosign keys</w:t>
+            </w:r>
+          </w:p>
+        </w:tc>
+        <w:tc>
+          <w:tcPr>
+            <w:tcW w:type="dxa" w:w="2880"/>
+          </w:tcPr>
+          <w:p>
+            <w:r>
+              <w:t>GitHub Secrets + Kyverno</w:t>
+            </w:r>
+          </w:p>
+        </w:tc>
+        <w:tc>
+          <w:tcPr>
+            <w:tcW w:type="dxa" w:w="2880"/>
+          </w:tcPr>
+          <w:p>
+            <w:r>
+              <w:t>Signs images in CI, verifies in cluster</w:t>
+            </w:r>
+          </w:p>
+        </w:tc>
+      </w:tr>
+      <w:tr>
+        <w:tc>
+          <w:tcPr>
+            <w:tcW w:type="dxa" w:w="2880"/>
+          </w:tcPr>
+          <w:p>
+            <w:r>
+              <w:t>App (3 replicas)</w:t>
+            </w:r>
+          </w:p>
+        </w:tc>
+        <w:tc>
+          <w:tcPr>
+            <w:tcW w:type="dxa" w:w="2880"/>
+          </w:tcPr>
+          <w:p>
+            <w:r>
+              <w:t>default</w:t>
+            </w:r>
+          </w:p>
+        </w:tc>
+        <w:tc>
+          <w:tcPr>
+            <w:tcW w:type="dxa" w:w="2880"/>
+          </w:tcPr>
+          <w:p>
+            <w:r>
+              <w:t>Spring Boot API with ClusterIP service</w:t>
+            </w:r>
+          </w:p>
+        </w:tc>
+      </w:tr>
+    </w:tbl>
+    <w:p/>
+    <w:p>
+      <w:r>
+        <w:rPr>
+          <w:b/>
+          <w:color w:val="2E7D32"/>
+        </w:rPr>
+        <w:t>After this one-time setup, every new deployment is just: git push</w:t>
+      </w:r>
+    </w:p>
+    <w:p>
+      <w:r>
+        <w:br w:type="page"/>
+      </w:r>
+    </w:p>
     <w:p>
       <w:pPr>
         <w:pStyle w:val="Heading1"/>

</xml_diff>